<commit_message>
feat: Adicionar convenções de nomenclatura snake_case do EF Core e implementar os modelos de negócio e estruturas de repositório iniciais.
</commit_message>
<xml_diff>
--- a/Documentacao/1 - Missão, Visão e Valor.docx
+++ b/Documentacao/1 - Missão, Visão e Valor.docx
@@ -1,6 +1,6 @@
 
 <file path=word/document.xml><?xml version="1.0" encoding="utf-8"?>
-<w:document xmlns:wpc="http://schemas.microsoft.com/office/word/2010/wordprocessingCanvas" xmlns:cx="http://schemas.microsoft.com/office/drawing/2014/chartex" xmlns:cx1="http://schemas.microsoft.com/office/drawing/2015/9/8/chartex" xmlns:cx2="http://schemas.microsoft.com/office/drawing/2015/10/21/chartex" xmlns:cx3="http://schemas.microsoft.com/office/drawing/2016/5/9/chartex" xmlns:cx4="http://schemas.microsoft.com/office/drawing/2016/5/10/chartex" xmlns:cx5="http://schemas.microsoft.com/office/drawing/2016/5/11/chartex" xmlns:cx6="http://schemas.microsoft.com/office/drawing/2016/5/12/chartex" xmlns:cx7="http://schemas.microsoft.com/office/drawing/2016/5/13/chartex" xmlns:cx8="http://schemas.microsoft.com/office/drawing/2016/5/14/chartex" xmlns:mc="http://schemas.openxmlformats.org/markup-compatibility/2006" xmlns:aink="http://schemas.microsoft.com/office/drawing/2016/ink" xmlns:am3d="http://schemas.microsoft.com/office/drawing/2017/model3d" xmlns:o="urn:schemas-microsoft-com:office:office" xmlns:oel="http://schemas.microsoft.com/office/2019/extlst" xmlns:r="http://schemas.openxmlformats.org/officeDocument/2006/relationships" xmlns:m="http://schemas.openxmlformats.org/officeDocument/2006/math" xmlns:v="urn:schemas-microsoft-com:vml" xmlns:wp14="http://schemas.microsoft.com/office/word/2010/wordprocessingDrawing" xmlns:wp="http://schemas.openxmlformats.org/drawingml/2006/wordprocessingDrawing" xmlns:w10="urn:schemas-microsoft-com:office:word" xmlns:w="http://schemas.openxmlformats.org/wordprocessingml/2006/main" xmlns:w14="http://schemas.microsoft.com/office/word/2010/wordml" xmlns:w15="http://schemas.microsoft.com/office/word/2012/wordml" xmlns:w16cex="http://schemas.microsoft.com/office/word/2018/wordml/cex" xmlns:w16cid="http://schemas.microsoft.com/office/word/2016/wordml/cid" xmlns:w16="http://schemas.microsoft.com/office/word/2018/wordml" xmlns:w16du="http://schemas.microsoft.com/office/word/2023/wordml/word16du" xmlns:w16sdtdh="http://schemas.microsoft.com/office/word/2020/wordml/sdtdatahash" xmlns:w16sdtfl="http://schemas.microsoft.com/office/word/2024/wordml/sdtformatlock" xmlns:w16se="http://schemas.microsoft.com/office/word/2015/wordml/symex" xmlns:wpg="http://schemas.microsoft.com/office/word/2010/wordprocessingGroup" xmlns:wpi="http://schemas.microsoft.com/office/word/2010/wordprocessingInk" xmlns:wne="http://schemas.microsoft.com/office/word/2006/wordml" xmlns:wps="http://schemas.microsoft.com/office/word/2010/wordprocessingShape" mc:Ignorable="w14 w15 w16se w16cid w16 w16cex w16sdtdh w16sdtfl w16du wp14">
+<w:document xmlns:wpc="http://schemas.microsoft.com/office/word/2010/wordprocessingCanvas" xmlns:cx="http://schemas.microsoft.com/office/drawing/2014/chartex" xmlns:cx1="http://schemas.microsoft.com/office/drawing/2015/9/8/chartex" xmlns:cx2="http://schemas.microsoft.com/office/drawing/2015/10/21/chartex" xmlns:cx3="http://schemas.microsoft.com/office/drawing/2016/5/9/chartex" xmlns:cx4="http://schemas.microsoft.com/office/drawing/2016/5/10/chartex" xmlns:cx5="http://schemas.microsoft.com/office/drawing/2016/5/11/chartex" xmlns:cx6="http://schemas.microsoft.com/office/drawing/2016/5/12/chartex" xmlns:cx7="http://schemas.microsoft.com/office/drawing/2016/5/13/chartex" xmlns:cx8="http://schemas.microsoft.com/office/drawing/2016/5/14/chartex" xmlns:mc="http://schemas.openxmlformats.org/markup-compatibility/2006" xmlns:aink="http://schemas.microsoft.com/office/drawing/2016/ink" xmlns:am3d="http://schemas.microsoft.com/office/drawing/2017/model3d" xmlns:o="urn:schemas-microsoft-com:office:office" xmlns:oel="http://schemas.microsoft.com/office/2019/extlst" xmlns:r="http://schemas.openxmlformats.org/officeDocument/2006/relationships" xmlns:m="http://schemas.openxmlformats.org/officeDocument/2006/math" xmlns:v="urn:schemas-microsoft-com:vml" xmlns:wp14="http://schemas.microsoft.com/office/word/2010/wordprocessingDrawing" xmlns:wp="http://schemas.openxmlformats.org/drawingml/2006/wordprocessingDrawing" xmlns:w10="urn:schemas-microsoft-com:office:word" xmlns:w="http://schemas.openxmlformats.org/wordprocessingml/2006/main" xmlns:w14="http://schemas.microsoft.com/office/word/2010/wordml" xmlns:w15="http://schemas.microsoft.com/office/word/2012/wordml" xmlns:w16cei="http://schemas.microsoft.com/office/word/2026/wordml/cei" xmlns:w16cex="http://schemas.microsoft.com/office/word/2018/wordml/cex" xmlns:w16cid="http://schemas.microsoft.com/office/word/2016/wordml/cid" xmlns:w16="http://schemas.microsoft.com/office/word/2018/wordml" xmlns:w16du="http://schemas.microsoft.com/office/word/2023/wordml/word16du" xmlns:w16sdtdh="http://schemas.microsoft.com/office/word/2020/wordml/sdtdatahash" xmlns:w16sdtfl="http://schemas.microsoft.com/office/word/2024/wordml/sdtformatlock" xmlns:w16se="http://schemas.microsoft.com/office/word/2015/wordml/symex" xmlns:wpg="http://schemas.microsoft.com/office/word/2010/wordprocessingGroup" xmlns:wpi="http://schemas.microsoft.com/office/word/2010/wordprocessingInk" xmlns:wne="http://schemas.microsoft.com/office/word/2006/wordml" xmlns:wps="http://schemas.microsoft.com/office/word/2010/wordprocessingShape" mc:Ignorable="w14 w15 w16se w16cid w16 w16cex w16sdtdh w16sdtfl w16du wp14">
   <w:body>
     <w:p>
       <w:pPr>
@@ -31,20 +31,8 @@
           <w:sz w:val="28"/>
           <w:szCs w:val="28"/>
         </w:rPr>
-        <w:t xml:space="preserve"> - </w:t>
-      </w:r>
-      <w:proofErr w:type="spellStart"/>
-      <w:r>
-        <w:rPr>
-          <w:rFonts w:ascii="Times New Roman" w:hAnsi="Times New Roman" w:cs="Times New Roman"/>
-          <w:b/>
-          <w:bCs/>
-          <w:sz w:val="28"/>
-          <w:szCs w:val="28"/>
-        </w:rPr>
-        <w:t>MechSystem</w:t>
-      </w:r>
-      <w:proofErr w:type="spellEnd"/>
+        <w:t xml:space="preserve"> - MechSystem</w:t>
+      </w:r>
     </w:p>
     <w:p>
       <w:pPr>
@@ -67,33 +55,7 @@
         <w:rPr>
           <w:rFonts w:ascii="Times New Roman" w:hAnsi="Times New Roman" w:cs="Times New Roman"/>
         </w:rPr>
-        <w:t xml:space="preserve">: </w:t>
-      </w:r>
-      <w:proofErr w:type="spellStart"/>
-      <w:r>
-        <w:rPr>
-          <w:rFonts w:ascii="Times New Roman" w:hAnsi="Times New Roman" w:cs="Times New Roman"/>
-        </w:rPr>
-        <w:t>MechSystem</w:t>
-      </w:r>
-      <w:proofErr w:type="spellEnd"/>
-      <w:r>
-        <w:rPr>
-          <w:rFonts w:ascii="Times New Roman" w:hAnsi="Times New Roman" w:cs="Times New Roman"/>
-        </w:rPr>
-        <w:t xml:space="preserve"> — Sistema</w:t>
-      </w:r>
-      <w:r>
-        <w:rPr>
-          <w:rFonts w:ascii="Times New Roman" w:hAnsi="Times New Roman" w:cs="Times New Roman"/>
-        </w:rPr>
-        <w:t xml:space="preserve"> </w:t>
-      </w:r>
-      <w:r>
-        <w:rPr>
-          <w:rFonts w:ascii="Times New Roman" w:hAnsi="Times New Roman" w:cs="Times New Roman"/>
-        </w:rPr>
-        <w:t>de Gestão para Oficinas Mecânicas</w:t>
+        <w:t>: MechSystem — Sistema de Gestão para Oficinas Mecânicas</w:t>
       </w:r>
       <w:r>
         <w:rPr>
@@ -169,34 +131,6 @@
         </w:rPr>
         <w:t>: Ryan Cristian</w:t>
       </w:r>
-      <w:r>
-        <w:rPr>
-          <w:rFonts w:ascii="Times New Roman" w:hAnsi="Times New Roman" w:cs="Times New Roman"/>
-        </w:rPr>
-        <w:br/>
-      </w:r>
-      <w:r>
-        <w:rPr>
-          <w:rFonts w:ascii="Times New Roman" w:hAnsi="Times New Roman" w:cs="Times New Roman"/>
-          <w:b/>
-          <w:bCs/>
-        </w:rPr>
-        <w:t>Disciplina</w:t>
-      </w:r>
-      <w:r>
-        <w:rPr>
-          <w:rFonts w:ascii="Times New Roman" w:hAnsi="Times New Roman" w:cs="Times New Roman"/>
-        </w:rPr>
-        <w:t xml:space="preserve">: Engenharia de Software III — Prof. Alessandro </w:t>
-      </w:r>
-      <w:proofErr w:type="spellStart"/>
-      <w:r>
-        <w:rPr>
-          <w:rFonts w:ascii="Times New Roman" w:hAnsi="Times New Roman" w:cs="Times New Roman"/>
-        </w:rPr>
-        <w:t>Fukuta</w:t>
-      </w:r>
-      <w:proofErr w:type="spellEnd"/>
     </w:p>
     <w:p>
       <w:pPr>
@@ -593,7 +527,6 @@
               <w:pStyle w:val="NormalWeb"/>
             </w:pPr>
             <w:r>
-              <w:lastRenderedPageBreak/>
               <w:t>2028</w:t>
             </w:r>
           </w:p>
@@ -838,21 +771,7 @@
         <w:rPr>
           <w:rFonts w:ascii="Times New Roman" w:hAnsi="Times New Roman" w:cs="Times New Roman"/>
         </w:rPr>
-        <w:t xml:space="preserve">. O </w:t>
-      </w:r>
-      <w:proofErr w:type="spellStart"/>
-      <w:r>
-        <w:rPr>
-          <w:rFonts w:ascii="Times New Roman" w:hAnsi="Times New Roman" w:cs="Times New Roman"/>
-        </w:rPr>
-        <w:t>MechSystem</w:t>
-      </w:r>
-      <w:proofErr w:type="spellEnd"/>
-      <w:r>
-        <w:rPr>
-          <w:rFonts w:ascii="Times New Roman" w:hAnsi="Times New Roman" w:cs="Times New Roman"/>
-        </w:rPr>
-        <w:t xml:space="preserve"> preza pela integridade dos dados, backups automáticos, controle de acesso por perfis (RBAC) e criptografia de senhas com </w:t>
+        <w:t xml:space="preserve">. O MechSystem preza pela integridade dos dados, backups automáticos, controle de acesso por perfis (RBAC) e criptografia de senhas com </w:t>
       </w:r>
       <w:proofErr w:type="spellStart"/>
       <w:r>
@@ -962,21 +881,7 @@
         <w:rPr>
           <w:rFonts w:ascii="Times New Roman" w:hAnsi="Times New Roman" w:cs="Times New Roman"/>
         </w:rPr>
-        <w:t xml:space="preserve">O projeto utiliza tecnologias de ponta (.NET 10, </w:t>
-      </w:r>
-      <w:proofErr w:type="spellStart"/>
-      <w:r>
-        <w:rPr>
-          <w:rFonts w:ascii="Times New Roman" w:hAnsi="Times New Roman" w:cs="Times New Roman"/>
-        </w:rPr>
-        <w:t>Blazor</w:t>
-      </w:r>
-      <w:proofErr w:type="spellEnd"/>
-      <w:r>
-        <w:rPr>
-          <w:rFonts w:ascii="Times New Roman" w:hAnsi="Times New Roman" w:cs="Times New Roman"/>
-        </w:rPr>
-        <w:t xml:space="preserve"> Server, Entity Framework Core 10) e segue práticas modernas de engenharia de software: Clean </w:t>
+        <w:t xml:space="preserve">O projeto utiliza tecnologias de ponta (.NET 10, Blazor Server, Entity Framework Core 10) e segue práticas modernas de engenharia de software: Clean </w:t>
       </w:r>
       <w:proofErr w:type="spellStart"/>
       <w:r>
@@ -1077,15 +982,7 @@
         <w:pStyle w:val="NormalWeb"/>
       </w:pPr>
       <w:r>
-        <w:t xml:space="preserve">O </w:t>
-      </w:r>
-      <w:proofErr w:type="spellStart"/>
-      <w:r>
-        <w:t>MechSystem</w:t>
-      </w:r>
-      <w:proofErr w:type="spellEnd"/>
-      <w:r>
-        <w:t xml:space="preserve"> é projetado para ser </w:t>
+        <w:t xml:space="preserve">O MechSystem é projetado para ser </w:t>
       </w:r>
       <w:r>
         <w:rPr>
@@ -1094,15 +991,7 @@
         <w:t>economicamente viável para micro e pequenas oficinas</w:t>
       </w:r>
       <w:r>
-        <w:t xml:space="preserve">, utilizando </w:t>
-      </w:r>
-      <w:proofErr w:type="spellStart"/>
-      <w:r>
-        <w:t>SQLite</w:t>
-      </w:r>
-      <w:proofErr w:type="spellEnd"/>
-      <w:r>
-        <w:t xml:space="preserve"> como banco de dados embutido (zero configuração) e podendo escalar para PostgreSQL conforme o crescimento do negócio.</w:t>
+        <w:t>, utilizando SQLite como banco de dados embutido (zero configuração) e podendo escalar para PostgreSQL conforme o crescimento do negócio.</w:t>
       </w:r>
     </w:p>
     <w:sectPr>
@@ -1118,7 +1007,7 @@
 </file>
 
 <file path=word/endnotes.xml><?xml version="1.0" encoding="utf-8"?>
-<w:endnotes xmlns:wpc="http://schemas.microsoft.com/office/word/2010/wordprocessingCanvas" xmlns:cx="http://schemas.microsoft.com/office/drawing/2014/chartex" xmlns:cx1="http://schemas.microsoft.com/office/drawing/2015/9/8/chartex" xmlns:cx2="http://schemas.microsoft.com/office/drawing/2015/10/21/chartex" xmlns:cx3="http://schemas.microsoft.com/office/drawing/2016/5/9/chartex" xmlns:cx4="http://schemas.microsoft.com/office/drawing/2016/5/10/chartex" xmlns:cx5="http://schemas.microsoft.com/office/drawing/2016/5/11/chartex" xmlns:cx6="http://schemas.microsoft.com/office/drawing/2016/5/12/chartex" xmlns:cx7="http://schemas.microsoft.com/office/drawing/2016/5/13/chartex" xmlns:cx8="http://schemas.microsoft.com/office/drawing/2016/5/14/chartex" xmlns:mc="http://schemas.openxmlformats.org/markup-compatibility/2006" xmlns:aink="http://schemas.microsoft.com/office/drawing/2016/ink" xmlns:am3d="http://schemas.microsoft.com/office/drawing/2017/model3d" xmlns:o="urn:schemas-microsoft-com:office:office" xmlns:oel="http://schemas.microsoft.com/office/2019/extlst" xmlns:r="http://schemas.openxmlformats.org/officeDocument/2006/relationships" xmlns:m="http://schemas.openxmlformats.org/officeDocument/2006/math" xmlns:v="urn:schemas-microsoft-com:vml" xmlns:wp14="http://schemas.microsoft.com/office/word/2010/wordprocessingDrawing" xmlns:wp="http://schemas.openxmlformats.org/drawingml/2006/wordprocessingDrawing" xmlns:w10="urn:schemas-microsoft-com:office:word" xmlns:w="http://schemas.openxmlformats.org/wordprocessingml/2006/main" xmlns:w14="http://schemas.microsoft.com/office/word/2010/wordml" xmlns:w15="http://schemas.microsoft.com/office/word/2012/wordml" xmlns:w16cex="http://schemas.microsoft.com/office/word/2018/wordml/cex" xmlns:w16cid="http://schemas.microsoft.com/office/word/2016/wordml/cid" xmlns:w16="http://schemas.microsoft.com/office/word/2018/wordml" xmlns:w16du="http://schemas.microsoft.com/office/word/2023/wordml/word16du" xmlns:w16sdtdh="http://schemas.microsoft.com/office/word/2020/wordml/sdtdatahash" xmlns:w16sdtfl="http://schemas.microsoft.com/office/word/2024/wordml/sdtformatlock" xmlns:w16se="http://schemas.microsoft.com/office/word/2015/wordml/symex" xmlns:wpg="http://schemas.microsoft.com/office/word/2010/wordprocessingGroup" xmlns:wpi="http://schemas.microsoft.com/office/word/2010/wordprocessingInk" xmlns:wne="http://schemas.microsoft.com/office/word/2006/wordml" xmlns:wps="http://schemas.microsoft.com/office/word/2010/wordprocessingShape" mc:Ignorable="w14 w15 w16se w16cid w16 w16cex w16sdtdh w16sdtfl w16du wp14">
+<w:endnotes xmlns:wpc="http://schemas.microsoft.com/office/word/2010/wordprocessingCanvas" xmlns:cx="http://schemas.microsoft.com/office/drawing/2014/chartex" xmlns:cx1="http://schemas.microsoft.com/office/drawing/2015/9/8/chartex" xmlns:cx2="http://schemas.microsoft.com/office/drawing/2015/10/21/chartex" xmlns:cx3="http://schemas.microsoft.com/office/drawing/2016/5/9/chartex" xmlns:cx4="http://schemas.microsoft.com/office/drawing/2016/5/10/chartex" xmlns:cx5="http://schemas.microsoft.com/office/drawing/2016/5/11/chartex" xmlns:cx6="http://schemas.microsoft.com/office/drawing/2016/5/12/chartex" xmlns:cx7="http://schemas.microsoft.com/office/drawing/2016/5/13/chartex" xmlns:cx8="http://schemas.microsoft.com/office/drawing/2016/5/14/chartex" xmlns:mc="http://schemas.openxmlformats.org/markup-compatibility/2006" xmlns:aink="http://schemas.microsoft.com/office/drawing/2016/ink" xmlns:am3d="http://schemas.microsoft.com/office/drawing/2017/model3d" xmlns:o="urn:schemas-microsoft-com:office:office" xmlns:oel="http://schemas.microsoft.com/office/2019/extlst" xmlns:r="http://schemas.openxmlformats.org/officeDocument/2006/relationships" xmlns:m="http://schemas.openxmlformats.org/officeDocument/2006/math" xmlns:v="urn:schemas-microsoft-com:vml" xmlns:wp14="http://schemas.microsoft.com/office/word/2010/wordprocessingDrawing" xmlns:wp="http://schemas.openxmlformats.org/drawingml/2006/wordprocessingDrawing" xmlns:w10="urn:schemas-microsoft-com:office:word" xmlns:w="http://schemas.openxmlformats.org/wordprocessingml/2006/main" xmlns:w14="http://schemas.microsoft.com/office/word/2010/wordml" xmlns:w15="http://schemas.microsoft.com/office/word/2012/wordml" xmlns:w16cei="http://schemas.microsoft.com/office/word/2026/wordml/cei" xmlns:w16cex="http://schemas.microsoft.com/office/word/2018/wordml/cex" xmlns:w16cid="http://schemas.microsoft.com/office/word/2016/wordml/cid" xmlns:w16="http://schemas.microsoft.com/office/word/2018/wordml" xmlns:w16du="http://schemas.microsoft.com/office/word/2023/wordml/word16du" xmlns:w16sdtdh="http://schemas.microsoft.com/office/word/2020/wordml/sdtdatahash" xmlns:w16sdtfl="http://schemas.microsoft.com/office/word/2024/wordml/sdtformatlock" xmlns:w16se="http://schemas.microsoft.com/office/word/2015/wordml/symex" xmlns:wpg="http://schemas.microsoft.com/office/word/2010/wordprocessingGroup" xmlns:wpi="http://schemas.microsoft.com/office/word/2010/wordprocessingInk" xmlns:wne="http://schemas.microsoft.com/office/word/2006/wordml" xmlns:wps="http://schemas.microsoft.com/office/word/2010/wordprocessingShape" mc:Ignorable="w14 w15 w16se w16cid w16 w16cex w16sdtdh w16sdtfl w16du wp14">
   <w:endnote w:type="separator" w:id="-1">
     <w:p>
       <w:pPr>
@@ -1143,7 +1032,7 @@
 </file>
 
 <file path=word/footer1.xml><?xml version="1.0" encoding="utf-8"?>
-<w:ftr xmlns:wpc="http://schemas.microsoft.com/office/word/2010/wordprocessingCanvas" xmlns:cx="http://schemas.microsoft.com/office/drawing/2014/chartex" xmlns:cx1="http://schemas.microsoft.com/office/drawing/2015/9/8/chartex" xmlns:cx2="http://schemas.microsoft.com/office/drawing/2015/10/21/chartex" xmlns:cx3="http://schemas.microsoft.com/office/drawing/2016/5/9/chartex" xmlns:cx4="http://schemas.microsoft.com/office/drawing/2016/5/10/chartex" xmlns:cx5="http://schemas.microsoft.com/office/drawing/2016/5/11/chartex" xmlns:cx6="http://schemas.microsoft.com/office/drawing/2016/5/12/chartex" xmlns:cx7="http://schemas.microsoft.com/office/drawing/2016/5/13/chartex" xmlns:cx8="http://schemas.microsoft.com/office/drawing/2016/5/14/chartex" xmlns:mc="http://schemas.openxmlformats.org/markup-compatibility/2006" xmlns:aink="http://schemas.microsoft.com/office/drawing/2016/ink" xmlns:am3d="http://schemas.microsoft.com/office/drawing/2017/model3d" xmlns:o="urn:schemas-microsoft-com:office:office" xmlns:oel="http://schemas.microsoft.com/office/2019/extlst" xmlns:r="http://schemas.openxmlformats.org/officeDocument/2006/relationships" xmlns:m="http://schemas.openxmlformats.org/officeDocument/2006/math" xmlns:v="urn:schemas-microsoft-com:vml" xmlns:wp14="http://schemas.microsoft.com/office/word/2010/wordprocessingDrawing" xmlns:wp="http://schemas.openxmlformats.org/drawingml/2006/wordprocessingDrawing" xmlns:w10="urn:schemas-microsoft-com:office:word" xmlns:w="http://schemas.openxmlformats.org/wordprocessingml/2006/main" xmlns:w14="http://schemas.microsoft.com/office/word/2010/wordml" xmlns:w15="http://schemas.microsoft.com/office/word/2012/wordml" xmlns:w16cex="http://schemas.microsoft.com/office/word/2018/wordml/cex" xmlns:w16cid="http://schemas.microsoft.com/office/word/2016/wordml/cid" xmlns:w16="http://schemas.microsoft.com/office/word/2018/wordml" xmlns:w16du="http://schemas.microsoft.com/office/word/2023/wordml/word16du" xmlns:w16sdtdh="http://schemas.microsoft.com/office/word/2020/wordml/sdtdatahash" xmlns:w16sdtfl="http://schemas.microsoft.com/office/word/2024/wordml/sdtformatlock" xmlns:w16se="http://schemas.microsoft.com/office/word/2015/wordml/symex" xmlns:wpg="http://schemas.microsoft.com/office/word/2010/wordprocessingGroup" xmlns:wpi="http://schemas.microsoft.com/office/word/2010/wordprocessingInk" xmlns:wne="http://schemas.microsoft.com/office/word/2006/wordml" xmlns:wps="http://schemas.microsoft.com/office/word/2010/wordprocessingShape" mc:Ignorable="w14 w15 w16se w16cid w16 w16cex w16sdtdh w16sdtfl w16du wp14">
+<w:ftr xmlns:wpc="http://schemas.microsoft.com/office/word/2010/wordprocessingCanvas" xmlns:cx="http://schemas.microsoft.com/office/drawing/2014/chartex" xmlns:cx1="http://schemas.microsoft.com/office/drawing/2015/9/8/chartex" xmlns:cx2="http://schemas.microsoft.com/office/drawing/2015/10/21/chartex" xmlns:cx3="http://schemas.microsoft.com/office/drawing/2016/5/9/chartex" xmlns:cx4="http://schemas.microsoft.com/office/drawing/2016/5/10/chartex" xmlns:cx5="http://schemas.microsoft.com/office/drawing/2016/5/11/chartex" xmlns:cx6="http://schemas.microsoft.com/office/drawing/2016/5/12/chartex" xmlns:cx7="http://schemas.microsoft.com/office/drawing/2016/5/13/chartex" xmlns:cx8="http://schemas.microsoft.com/office/drawing/2016/5/14/chartex" xmlns:mc="http://schemas.openxmlformats.org/markup-compatibility/2006" xmlns:aink="http://schemas.microsoft.com/office/drawing/2016/ink" xmlns:am3d="http://schemas.microsoft.com/office/drawing/2017/model3d" xmlns:o="urn:schemas-microsoft-com:office:office" xmlns:oel="http://schemas.microsoft.com/office/2019/extlst" xmlns:r="http://schemas.openxmlformats.org/officeDocument/2006/relationships" xmlns:m="http://schemas.openxmlformats.org/officeDocument/2006/math" xmlns:v="urn:schemas-microsoft-com:vml" xmlns:wp14="http://schemas.microsoft.com/office/word/2010/wordprocessingDrawing" xmlns:wp="http://schemas.openxmlformats.org/drawingml/2006/wordprocessingDrawing" xmlns:w10="urn:schemas-microsoft-com:office:word" xmlns:w="http://schemas.openxmlformats.org/wordprocessingml/2006/main" xmlns:w14="http://schemas.microsoft.com/office/word/2010/wordml" xmlns:w15="http://schemas.microsoft.com/office/word/2012/wordml" xmlns:w16cei="http://schemas.microsoft.com/office/word/2026/wordml/cei" xmlns:w16cex="http://schemas.microsoft.com/office/word/2018/wordml/cex" xmlns:w16cid="http://schemas.microsoft.com/office/word/2016/wordml/cid" xmlns:w16="http://schemas.microsoft.com/office/word/2018/wordml" xmlns:w16du="http://schemas.microsoft.com/office/word/2023/wordml/word16du" xmlns:w16sdtdh="http://schemas.microsoft.com/office/word/2020/wordml/sdtdatahash" xmlns:w16sdtfl="http://schemas.microsoft.com/office/word/2024/wordml/sdtformatlock" xmlns:w16se="http://schemas.microsoft.com/office/word/2015/wordml/symex" xmlns:wpg="http://schemas.microsoft.com/office/word/2010/wordprocessingGroup" xmlns:wpi="http://schemas.microsoft.com/office/word/2010/wordprocessingInk" xmlns:wne="http://schemas.microsoft.com/office/word/2006/wordml" xmlns:wps="http://schemas.microsoft.com/office/word/2010/wordprocessingShape" mc:Ignorable="w14 w15 w16se w16cid w16 w16cex w16sdtdh w16sdtfl w16du wp14">
   <w:sdt>
     <w:sdtPr>
       <w:id w:val="-1835298562"/>
@@ -1185,7 +1074,7 @@
 </file>
 
 <file path=word/footnotes.xml><?xml version="1.0" encoding="utf-8"?>
-<w:footnotes xmlns:wpc="http://schemas.microsoft.com/office/word/2010/wordprocessingCanvas" xmlns:cx="http://schemas.microsoft.com/office/drawing/2014/chartex" xmlns:cx1="http://schemas.microsoft.com/office/drawing/2015/9/8/chartex" xmlns:cx2="http://schemas.microsoft.com/office/drawing/2015/10/21/chartex" xmlns:cx3="http://schemas.microsoft.com/office/drawing/2016/5/9/chartex" xmlns:cx4="http://schemas.microsoft.com/office/drawing/2016/5/10/chartex" xmlns:cx5="http://schemas.microsoft.com/office/drawing/2016/5/11/chartex" xmlns:cx6="http://schemas.microsoft.com/office/drawing/2016/5/12/chartex" xmlns:cx7="http://schemas.microsoft.com/office/drawing/2016/5/13/chartex" xmlns:cx8="http://schemas.microsoft.com/office/drawing/2016/5/14/chartex" xmlns:mc="http://schemas.openxmlformats.org/markup-compatibility/2006" xmlns:aink="http://schemas.microsoft.com/office/drawing/2016/ink" xmlns:am3d="http://schemas.microsoft.com/office/drawing/2017/model3d" xmlns:o="urn:schemas-microsoft-com:office:office" xmlns:oel="http://schemas.microsoft.com/office/2019/extlst" xmlns:r="http://schemas.openxmlformats.org/officeDocument/2006/relationships" xmlns:m="http://schemas.openxmlformats.org/officeDocument/2006/math" xmlns:v="urn:schemas-microsoft-com:vml" xmlns:wp14="http://schemas.microsoft.com/office/word/2010/wordprocessingDrawing" xmlns:wp="http://schemas.openxmlformats.org/drawingml/2006/wordprocessingDrawing" xmlns:w10="urn:schemas-microsoft-com:office:word" xmlns:w="http://schemas.openxmlformats.org/wordprocessingml/2006/main" xmlns:w14="http://schemas.microsoft.com/office/word/2010/wordml" xmlns:w15="http://schemas.microsoft.com/office/word/2012/wordml" xmlns:w16cex="http://schemas.microsoft.com/office/word/2018/wordml/cex" xmlns:w16cid="http://schemas.microsoft.com/office/word/2016/wordml/cid" xmlns:w16="http://schemas.microsoft.com/office/word/2018/wordml" xmlns:w16du="http://schemas.microsoft.com/office/word/2023/wordml/word16du" xmlns:w16sdtdh="http://schemas.microsoft.com/office/word/2020/wordml/sdtdatahash" xmlns:w16sdtfl="http://schemas.microsoft.com/office/word/2024/wordml/sdtformatlock" xmlns:w16se="http://schemas.microsoft.com/office/word/2015/wordml/symex" xmlns:wpg="http://schemas.microsoft.com/office/word/2010/wordprocessingGroup" xmlns:wpi="http://schemas.microsoft.com/office/word/2010/wordprocessingInk" xmlns:wne="http://schemas.microsoft.com/office/word/2006/wordml" xmlns:wps="http://schemas.microsoft.com/office/word/2010/wordprocessingShape" mc:Ignorable="w14 w15 w16se w16cid w16 w16cex w16sdtdh w16sdtfl w16du wp14">
+<w:footnotes xmlns:wpc="http://schemas.microsoft.com/office/word/2010/wordprocessingCanvas" xmlns:cx="http://schemas.microsoft.com/office/drawing/2014/chartex" xmlns:cx1="http://schemas.microsoft.com/office/drawing/2015/9/8/chartex" xmlns:cx2="http://schemas.microsoft.com/office/drawing/2015/10/21/chartex" xmlns:cx3="http://schemas.microsoft.com/office/drawing/2016/5/9/chartex" xmlns:cx4="http://schemas.microsoft.com/office/drawing/2016/5/10/chartex" xmlns:cx5="http://schemas.microsoft.com/office/drawing/2016/5/11/chartex" xmlns:cx6="http://schemas.microsoft.com/office/drawing/2016/5/12/chartex" xmlns:cx7="http://schemas.microsoft.com/office/drawing/2016/5/13/chartex" xmlns:cx8="http://schemas.microsoft.com/office/drawing/2016/5/14/chartex" xmlns:mc="http://schemas.openxmlformats.org/markup-compatibility/2006" xmlns:aink="http://schemas.microsoft.com/office/drawing/2016/ink" xmlns:am3d="http://schemas.microsoft.com/office/drawing/2017/model3d" xmlns:o="urn:schemas-microsoft-com:office:office" xmlns:oel="http://schemas.microsoft.com/office/2019/extlst" xmlns:r="http://schemas.openxmlformats.org/officeDocument/2006/relationships" xmlns:m="http://schemas.openxmlformats.org/officeDocument/2006/math" xmlns:v="urn:schemas-microsoft-com:vml" xmlns:wp14="http://schemas.microsoft.com/office/word/2010/wordprocessingDrawing" xmlns:wp="http://schemas.openxmlformats.org/drawingml/2006/wordprocessingDrawing" xmlns:w10="urn:schemas-microsoft-com:office:word" xmlns:w="http://schemas.openxmlformats.org/wordprocessingml/2006/main" xmlns:w14="http://schemas.microsoft.com/office/word/2010/wordml" xmlns:w15="http://schemas.microsoft.com/office/word/2012/wordml" xmlns:w16cei="http://schemas.microsoft.com/office/word/2026/wordml/cei" xmlns:w16cex="http://schemas.microsoft.com/office/word/2018/wordml/cex" xmlns:w16cid="http://schemas.microsoft.com/office/word/2016/wordml/cid" xmlns:w16="http://schemas.microsoft.com/office/word/2018/wordml" xmlns:w16du="http://schemas.microsoft.com/office/word/2023/wordml/word16du" xmlns:w16sdtdh="http://schemas.microsoft.com/office/word/2020/wordml/sdtdatahash" xmlns:w16sdtfl="http://schemas.microsoft.com/office/word/2024/wordml/sdtformatlock" xmlns:w16se="http://schemas.microsoft.com/office/word/2015/wordml/symex" xmlns:wpg="http://schemas.microsoft.com/office/word/2010/wordprocessingGroup" xmlns:wpi="http://schemas.microsoft.com/office/word/2010/wordprocessingInk" xmlns:wne="http://schemas.microsoft.com/office/word/2006/wordml" xmlns:wps="http://schemas.microsoft.com/office/word/2010/wordprocessingShape" mc:Ignorable="w14 w15 w16se w16cid w16 w16cex w16sdtdh w16sdtfl w16du wp14">
   <w:footnote w:type="separator" w:id="-1">
     <w:p>
       <w:pPr>
@@ -1210,7 +1099,7 @@
 </file>
 
 <file path=word/header1.xml><?xml version="1.0" encoding="utf-8"?>
-<w:hdr xmlns:wpc="http://schemas.microsoft.com/office/word/2010/wordprocessingCanvas" xmlns:cx="http://schemas.microsoft.com/office/drawing/2014/chartex" xmlns:cx1="http://schemas.microsoft.com/office/drawing/2015/9/8/chartex" xmlns:cx2="http://schemas.microsoft.com/office/drawing/2015/10/21/chartex" xmlns:cx3="http://schemas.microsoft.com/office/drawing/2016/5/9/chartex" xmlns:cx4="http://schemas.microsoft.com/office/drawing/2016/5/10/chartex" xmlns:cx5="http://schemas.microsoft.com/office/drawing/2016/5/11/chartex" xmlns:cx6="http://schemas.microsoft.com/office/drawing/2016/5/12/chartex" xmlns:cx7="http://schemas.microsoft.com/office/drawing/2016/5/13/chartex" xmlns:cx8="http://schemas.microsoft.com/office/drawing/2016/5/14/chartex" xmlns:mc="http://schemas.openxmlformats.org/markup-compatibility/2006" xmlns:aink="http://schemas.microsoft.com/office/drawing/2016/ink" xmlns:am3d="http://schemas.microsoft.com/office/drawing/2017/model3d" xmlns:o="urn:schemas-microsoft-com:office:office" xmlns:oel="http://schemas.microsoft.com/office/2019/extlst" xmlns:r="http://schemas.openxmlformats.org/officeDocument/2006/relationships" xmlns:m="http://schemas.openxmlformats.org/officeDocument/2006/math" xmlns:v="urn:schemas-microsoft-com:vml" xmlns:wp14="http://schemas.microsoft.com/office/word/2010/wordprocessingDrawing" xmlns:wp="http://schemas.openxmlformats.org/drawingml/2006/wordprocessingDrawing" xmlns:w10="urn:schemas-microsoft-com:office:word" xmlns:w="http://schemas.openxmlformats.org/wordprocessingml/2006/main" xmlns:w14="http://schemas.microsoft.com/office/word/2010/wordml" xmlns:w15="http://schemas.microsoft.com/office/word/2012/wordml" xmlns:w16cex="http://schemas.microsoft.com/office/word/2018/wordml/cex" xmlns:w16cid="http://schemas.microsoft.com/office/word/2016/wordml/cid" xmlns:w16="http://schemas.microsoft.com/office/word/2018/wordml" xmlns:w16du="http://schemas.microsoft.com/office/word/2023/wordml/word16du" xmlns:w16sdtdh="http://schemas.microsoft.com/office/word/2020/wordml/sdtdatahash" xmlns:w16sdtfl="http://schemas.microsoft.com/office/word/2024/wordml/sdtformatlock" xmlns:w16se="http://schemas.microsoft.com/office/word/2015/wordml/symex" xmlns:wpg="http://schemas.microsoft.com/office/word/2010/wordprocessingGroup" xmlns:wpi="http://schemas.microsoft.com/office/word/2010/wordprocessingInk" xmlns:wne="http://schemas.microsoft.com/office/word/2006/wordml" xmlns:wps="http://schemas.microsoft.com/office/word/2010/wordprocessingShape" mc:Ignorable="w14 w15 w16se w16cid w16 w16cex w16sdtdh w16sdtfl w16du wp14">
+<w:hdr xmlns:wpc="http://schemas.microsoft.com/office/word/2010/wordprocessingCanvas" xmlns:cx="http://schemas.microsoft.com/office/drawing/2014/chartex" xmlns:cx1="http://schemas.microsoft.com/office/drawing/2015/9/8/chartex" xmlns:cx2="http://schemas.microsoft.com/office/drawing/2015/10/21/chartex" xmlns:cx3="http://schemas.microsoft.com/office/drawing/2016/5/9/chartex" xmlns:cx4="http://schemas.microsoft.com/office/drawing/2016/5/10/chartex" xmlns:cx5="http://schemas.microsoft.com/office/drawing/2016/5/11/chartex" xmlns:cx6="http://schemas.microsoft.com/office/drawing/2016/5/12/chartex" xmlns:cx7="http://schemas.microsoft.com/office/drawing/2016/5/13/chartex" xmlns:cx8="http://schemas.microsoft.com/office/drawing/2016/5/14/chartex" xmlns:mc="http://schemas.openxmlformats.org/markup-compatibility/2006" xmlns:aink="http://schemas.microsoft.com/office/drawing/2016/ink" xmlns:am3d="http://schemas.microsoft.com/office/drawing/2017/model3d" xmlns:o="urn:schemas-microsoft-com:office:office" xmlns:oel="http://schemas.microsoft.com/office/2019/extlst" xmlns:r="http://schemas.openxmlformats.org/officeDocument/2006/relationships" xmlns:m="http://schemas.openxmlformats.org/officeDocument/2006/math" xmlns:v="urn:schemas-microsoft-com:vml" xmlns:wp14="http://schemas.microsoft.com/office/word/2010/wordprocessingDrawing" xmlns:wp="http://schemas.openxmlformats.org/drawingml/2006/wordprocessingDrawing" xmlns:w10="urn:schemas-microsoft-com:office:word" xmlns:w="http://schemas.openxmlformats.org/wordprocessingml/2006/main" xmlns:w14="http://schemas.microsoft.com/office/word/2010/wordml" xmlns:w15="http://schemas.microsoft.com/office/word/2012/wordml" xmlns:w16cei="http://schemas.microsoft.com/office/word/2026/wordml/cei" xmlns:w16cex="http://schemas.microsoft.com/office/word/2018/wordml/cex" xmlns:w16cid="http://schemas.microsoft.com/office/word/2016/wordml/cid" xmlns:w16="http://schemas.microsoft.com/office/word/2018/wordml" xmlns:w16du="http://schemas.microsoft.com/office/word/2023/wordml/word16du" xmlns:w16sdtdh="http://schemas.microsoft.com/office/word/2020/wordml/sdtdatahash" xmlns:w16sdtfl="http://schemas.microsoft.com/office/word/2024/wordml/sdtformatlock" xmlns:w16se="http://schemas.microsoft.com/office/word/2015/wordml/symex" xmlns:wpg="http://schemas.microsoft.com/office/word/2010/wordprocessingGroup" xmlns:wpi="http://schemas.microsoft.com/office/word/2010/wordprocessingInk" xmlns:wne="http://schemas.microsoft.com/office/word/2006/wordml" xmlns:wps="http://schemas.microsoft.com/office/word/2010/wordprocessingShape" mc:Ignorable="w14 w15 w16se w16cid w16 w16cex w16sdtdh w16sdtfl w16du wp14">
   <w:p>
     <w:pPr>
       <w:pStyle w:val="Cabealho"/>
@@ -1294,7 +1183,7 @@
 </file>
 
 <file path=word/numbering.xml><?xml version="1.0" encoding="utf-8"?>
-<w:numbering xmlns:wpc="http://schemas.microsoft.com/office/word/2010/wordprocessingCanvas" xmlns:cx="http://schemas.microsoft.com/office/drawing/2014/chartex" xmlns:cx1="http://schemas.microsoft.com/office/drawing/2015/9/8/chartex" xmlns:cx2="http://schemas.microsoft.com/office/drawing/2015/10/21/chartex" xmlns:cx3="http://schemas.microsoft.com/office/drawing/2016/5/9/chartex" xmlns:cx4="http://schemas.microsoft.com/office/drawing/2016/5/10/chartex" xmlns:cx5="http://schemas.microsoft.com/office/drawing/2016/5/11/chartex" xmlns:cx6="http://schemas.microsoft.com/office/drawing/2016/5/12/chartex" xmlns:cx7="http://schemas.microsoft.com/office/drawing/2016/5/13/chartex" xmlns:cx8="http://schemas.microsoft.com/office/drawing/2016/5/14/chartex" xmlns:mc="http://schemas.openxmlformats.org/markup-compatibility/2006" xmlns:aink="http://schemas.microsoft.com/office/drawing/2016/ink" xmlns:am3d="http://schemas.microsoft.com/office/drawing/2017/model3d" xmlns:o="urn:schemas-microsoft-com:office:office" xmlns:oel="http://schemas.microsoft.com/office/2019/extlst" xmlns:r="http://schemas.openxmlformats.org/officeDocument/2006/relationships" xmlns:m="http://schemas.openxmlformats.org/officeDocument/2006/math" xmlns:v="urn:schemas-microsoft-com:vml" xmlns:wp14="http://schemas.microsoft.com/office/word/2010/wordprocessingDrawing" xmlns:wp="http://schemas.openxmlformats.org/drawingml/2006/wordprocessingDrawing" xmlns:w10="urn:schemas-microsoft-com:office:word" xmlns:w="http://schemas.openxmlformats.org/wordprocessingml/2006/main" xmlns:w14="http://schemas.microsoft.com/office/word/2010/wordml" xmlns:w15="http://schemas.microsoft.com/office/word/2012/wordml" xmlns:w16cex="http://schemas.microsoft.com/office/word/2018/wordml/cex" xmlns:w16cid="http://schemas.microsoft.com/office/word/2016/wordml/cid" xmlns:w16="http://schemas.microsoft.com/office/word/2018/wordml" xmlns:w16du="http://schemas.microsoft.com/office/word/2023/wordml/word16du" xmlns:w16sdtdh="http://schemas.microsoft.com/office/word/2020/wordml/sdtdatahash" xmlns:w16sdtfl="http://schemas.microsoft.com/office/word/2024/wordml/sdtformatlock" xmlns:w16se="http://schemas.microsoft.com/office/word/2015/wordml/symex" xmlns:wpg="http://schemas.microsoft.com/office/word/2010/wordprocessingGroup" xmlns:wpi="http://schemas.microsoft.com/office/word/2010/wordprocessingInk" xmlns:wne="http://schemas.microsoft.com/office/word/2006/wordml" xmlns:wps="http://schemas.microsoft.com/office/word/2010/wordprocessingShape" mc:Ignorable="w14 w15 w16se w16cid w16 w16cex w16sdtdh w16sdtfl w16du wp14">
+<w:numbering xmlns:wpc="http://schemas.microsoft.com/office/word/2010/wordprocessingCanvas" xmlns:cx="http://schemas.microsoft.com/office/drawing/2014/chartex" xmlns:cx1="http://schemas.microsoft.com/office/drawing/2015/9/8/chartex" xmlns:cx2="http://schemas.microsoft.com/office/drawing/2015/10/21/chartex" xmlns:cx3="http://schemas.microsoft.com/office/drawing/2016/5/9/chartex" xmlns:cx4="http://schemas.microsoft.com/office/drawing/2016/5/10/chartex" xmlns:cx5="http://schemas.microsoft.com/office/drawing/2016/5/11/chartex" xmlns:cx6="http://schemas.microsoft.com/office/drawing/2016/5/12/chartex" xmlns:cx7="http://schemas.microsoft.com/office/drawing/2016/5/13/chartex" xmlns:cx8="http://schemas.microsoft.com/office/drawing/2016/5/14/chartex" xmlns:mc="http://schemas.openxmlformats.org/markup-compatibility/2006" xmlns:aink="http://schemas.microsoft.com/office/drawing/2016/ink" xmlns:am3d="http://schemas.microsoft.com/office/drawing/2017/model3d" xmlns:o="urn:schemas-microsoft-com:office:office" xmlns:oel="http://schemas.microsoft.com/office/2019/extlst" xmlns:r="http://schemas.openxmlformats.org/officeDocument/2006/relationships" xmlns:m="http://schemas.openxmlformats.org/officeDocument/2006/math" xmlns:v="urn:schemas-microsoft-com:vml" xmlns:wp14="http://schemas.microsoft.com/office/word/2010/wordprocessingDrawing" xmlns:wp="http://schemas.openxmlformats.org/drawingml/2006/wordprocessingDrawing" xmlns:w10="urn:schemas-microsoft-com:office:word" xmlns:w="http://schemas.openxmlformats.org/wordprocessingml/2006/main" xmlns:w14="http://schemas.microsoft.com/office/word/2010/wordml" xmlns:w15="http://schemas.microsoft.com/office/word/2012/wordml" xmlns:w16cei="http://schemas.microsoft.com/office/word/2026/wordml/cei" xmlns:w16cex="http://schemas.microsoft.com/office/word/2018/wordml/cex" xmlns:w16cid="http://schemas.microsoft.com/office/word/2016/wordml/cid" xmlns:w16="http://schemas.microsoft.com/office/word/2018/wordml" xmlns:w16du="http://schemas.microsoft.com/office/word/2023/wordml/word16du" xmlns:w16sdtdh="http://schemas.microsoft.com/office/word/2020/wordml/sdtdatahash" xmlns:w16sdtfl="http://schemas.microsoft.com/office/word/2024/wordml/sdtformatlock" xmlns:w16se="http://schemas.microsoft.com/office/word/2015/wordml/symex" xmlns:wpg="http://schemas.microsoft.com/office/word/2010/wordprocessingGroup" xmlns:wpi="http://schemas.microsoft.com/office/word/2010/wordprocessingInk" xmlns:wne="http://schemas.microsoft.com/office/word/2006/wordml" xmlns:wps="http://schemas.microsoft.com/office/word/2010/wordprocessingShape" mc:Ignorable="w14 w15 w16se w16cid w16 w16cex w16sdtdh w16sdtfl w16du wp14">
   <w:abstractNum w:abstractNumId="0" w15:restartNumberingAfterBreak="0">
     <w:nsid w:val="028837C3"/>
     <w:multiLevelType w:val="hybridMultilevel"/>
@@ -3714,6 +3603,7 @@
   <w:style w:type="character" w:default="1" w:styleId="Fontepargpadro">
     <w:name w:val="Default Paragraph Font"/>
     <w:uiPriority w:val="1"/>
+    <w:semiHidden/>
     <w:unhideWhenUsed/>
   </w:style>
   <w:style w:type="table" w:default="1" w:styleId="Tabelanormal">

</xml_diff>